<commit_message>
fix(plan-finca): revisión final aplicada — 0 B · 9 M · 26 m (9 M y 24 m arreglados)
M3: una sola regla (ninguna fecha en firme sin licencia; antes, reservas condicionadas con devolución
íntegra) en Word, contrato (cláusula Segunda bis), checklist, Excel, landing y correo. M6: la reserva
es «señal a cuenta del precio» regida por la tabla pactada (fuera las arras penitenciales). M4, M7:
notas de invierno e IVA del motor alineadas con la Tesorería y D4. M8: licencias y tasas sin IVA
(necesidad 360.503 €, sobrante 2.497 €). M1, M2, M5, M9 y 24 m de texto. Regenerados en el VPS:
ciclo.sh y D9 verdes, docx 6.906 palabras, contrato 150 párrafos, calculadora 588. Pendiente como deuda
común: PyG!G14 y Personal!C11 del motor, y la guía de equivalencias en Letter (las 53).

Via: Claude Code
Co-Authored-By: Claude Opus 5.5 <noreply@anthropic.com>
</commit_message>
<xml_diff>
--- a/astro-site/public/dl/plan-negocio-finca-eventos-bodas/modelo-contrato-reserva-finca-eventos.docx
+++ b/astro-site/public/dl/plan-negocio-finca-eventos-bodas/modelo-contrato-reserva-finca-eventos.docx
@@ -62,7 +62,7 @@
         <w:spacing w:after="160"/>
       </w:pPr>
       <w:r>
-        <w:t>Tres ideas guían los textos. Primera: la finca vende el espacio y sus servicios, y el catering exclusivo vende el menú y la barra, cada uno con su factura. Segunda: lo que se cobra y lo que se devuelve es proporcional y recíproco, para que las cláusulas aguanten una reclamación de un consumidor. Tercera: nunca se venden fechas de una finca que no tenga todavía las licencias para celebrar eventos.</w:t>
+        <w:t>Tres ideas guían los textos. Primera: la finca vende el espacio y sus servicios, y el catering exclusivo vende el menú y la barra, cada uno con su factura. Segunda: lo que se cobra y lo que se devuelve es proporcional y recíproco, para que las cláusulas aguanten una reclamación de un consumidor. Tercera: no se confirma en firme ninguna fecha de una finca que todavía no tenga las licencias para celebrar eventos; mientras tanto, solo se firman reservas condicionadas a la licencia (cláusula segunda bis), con devolución íntegra si no llega.</w:t>
       </w:r>
     </w:p>
     <w:p>
@@ -232,7 +232,7 @@
         <w:spacing w:after="160"/>
       </w:pPr>
       <w:r>
-        <w:t>La Finca declara que dispone de las licencias y autorizaciones necesarias para celebrar eventos en la finca y para el aforo y los usos que se contratan, y se compromete a mantenerlas vigentes hasta la fecha del evento. Entregará copia de la licencia de actividad al Cliente si este se lo pide por escrito.</w:t>
+        <w:t>La Finca declara que dispone de las licencias y autorizaciones necesarias para celebrar eventos en la finca y para el aforo y los usos que se contratan [o, si todavía no las tiene, que las ha solicitado y que este contrato es una reserva condicionada a la licencia según la cláusula segunda bis], y se compromete a mantenerlas vigentes hasta la fecha del evento. Entregará copia de la licencia de actividad al Cliente si este se lo pide por escrito.</w:t>
       </w:r>
     </w:p>
     <w:p>
@@ -241,6 +241,37 @@
       </w:pPr>
       <w:r>
         <w:t>Si, por cualquier causa, la Finca perdiera o no pudiera ejercer esas licencias antes del evento, lo comunicará al Cliente de inmediato y se aplicará lo previsto en la cláusula de cancelación por parte de la Finca.</w:t>
+      </w:r>
+    </w:p>
+    <w:p>
+      <w:pPr>
+        <w:keepNext/>
+        <w:spacing w:before="200"/>
+      </w:pPr>
+      <w:r>
+        <w:rPr>
+          <w:rFonts w:ascii="Inter" w:hAnsi="Inter"/>
+          <w:b/>
+          <w:color w:val="1F1B16"/>
+          <w:sz w:val="26"/>
+        </w:rPr>
+        <w:t>Segunda bis · Reserva condicionada a la licencia [solo si la Finca aún no la tiene]</w:t>
+      </w:r>
+    </w:p>
+    <w:p>
+      <w:pPr>
+        <w:spacing w:after="160"/>
+      </w:pPr>
+      <w:r>
+        <w:t>Este contrato es una reserva condicionada a la licencia: queda sujeto a la condición suspensiva de que la Finca obtenga las licencias y autorizaciones necesarias para celebrar el evento antes del [fecha límite, al menos seis meses antes del evento], y hasta entonces la fecha no queda confirmada en firme. Mientras la condición no se cumpla, la Finca solo cobra la reserva de la cláusula quinta. En cuanto obtenga las licencias, la Finca lo comunica por escrito al Cliente y, desde ese momento, la reserva es firme y se aplica todo el contrato.</w:t>
+      </w:r>
+    </w:p>
+    <w:p>
+      <w:pPr>
+        <w:spacing w:after="160"/>
+      </w:pPr>
+      <w:r>
+        <w:t>Si la condición no se cumple en esa fecha, el contrato queda sin efecto y la Finca devuelve al Cliente todo lo cobrado en un plazo de [14] días, sin retención ni penalización para el Cliente [y con una compensación de [importe] €].</w:t>
       </w:r>
     </w:p>
     <w:p>
@@ -273,7 +304,7 @@
         <w:spacing w:after="80"/>
       </w:pPr>
       <w:r>
-        <w:t>Mínimo garantizado: [número] invitados. El precio del espacio y los servicios se calcula sobre ese mínimo, aunque finalmente asistan menos personas.</w:t>
+        <w:t>Mínimo garantizado: [número] invitados, que el Cliente contrata con el Catering y sobre el que se calculan el menú y la logística del día, aunque finalmente asistan menos personas.</w:t>
       </w:r>
     </w:p>
     <w:p>
@@ -291,7 +322,7 @@
         <w:spacing w:after="80"/>
       </w:pPr>
       <w:r>
-        <w:t>Los invitados que excedan del mínimo se facturan al precio unitario de [importe] € más IVA por persona, en la factura de liquidación.</w:t>
+        <w:t>[Si la Finca cobra por invitado: los que excedan del mínimo se facturan a [importe] € más IVA por persona, en la factura de liquidación.]</w:t>
       </w:r>
     </w:p>
     <w:p>
@@ -382,7 +413,7 @@
         <w:t>Liquidación: 40 %</w:t>
       </w:r>
       <w:r>
-        <w:t xml:space="preserve"> ([importe] € con IVA), a 30 días del evento, es decir, el [fecha], junto con la diferencia por el recuento final de invitados si la hay.</w:t>
+        <w:t xml:space="preserve"> ([importe] € con IVA), a 30 días del evento, es decir, el [fecha], junto con la diferencia por el recuento final de invitados si la Finca cobra por invitado y la hay.</w:t>
       </w:r>
     </w:p>
     <w:p>
@@ -405,7 +436,7 @@
           <w:color w:val="1F1B16"/>
           <w:sz w:val="26"/>
         </w:rPr>
-        <w:t>Sexta · La reserva como señal con arras penitenciales</w:t>
+        <w:t>Sexta · La reserva como señal a cuenta del precio</w:t>
       </w:r>
     </w:p>
     <w:p>
@@ -413,7 +444,7 @@
         <w:spacing w:after="160"/>
       </w:pPr>
       <w:r>
-        <w:t>La cantidad entregada en concepto de reserva se entrega como señal con el carácter de arras penitenciales del artículo 1454 del Código Civil. Con ellas, el Cliente puede desistir del contrato perdiendo lo que corresponda según la cláusula de cancelación, y la Finca puede desistir devolviendo lo cobrado y compensando al Cliente según esa misma cláusula. Las arras forman parte del precio y se descuentan de él si el contrato se cumple.</w:t>
+        <w:t>La cantidad entregada como reserva es una señal a cuenta del precio, que se descuenta de él si el contrato se cumple. Si una de las partes cancela, la señal se rige exclusivamente por la tabla de cancelación pactada en la cláusula séptima y por su reciprocidad de la cláusula octava, que sustituyen a cualquier otro régimen general sobre la señal o las arras: si cancela el Cliente, la Finca retiene lo que fija la cláusula séptima; si cancela la Finca, devuelve todo lo cobrado e indemniza al Cliente con lo que fija la cláusula octava.</w:t>
       </w:r>
     </w:p>
     <w:p>
@@ -463,7 +494,7 @@
         <w:spacing w:after="80"/>
       </w:pPr>
       <w:r>
-        <w:t xml:space="preserve">De 6 a 11 meses: </w:t>
+        <w:t xml:space="preserve">De 6 meses a menos de 12: </w:t>
       </w:r>
       <w:r>
         <w:rPr>
@@ -481,7 +512,7 @@
         <w:spacing w:after="80"/>
       </w:pPr>
       <w:r>
-        <w:t xml:space="preserve">De 3 a 5 meses: </w:t>
+        <w:t xml:space="preserve">De 3 meses a menos de 6: </w:t>
       </w:r>
       <w:r>
         <w:rPr>
@@ -499,7 +530,7 @@
         <w:spacing w:after="80"/>
       </w:pPr>
       <w:r>
-        <w:t xml:space="preserve">De 1 a 2 meses: </w:t>
+        <w:t xml:space="preserve">De 1 mes a menos de 3: </w:t>
       </w:r>
       <w:r>
         <w:rPr>
@@ -526,7 +557,7 @@
         <w:t>100 %</w:t>
       </w:r>
       <w:r>
-        <w:t xml:space="preserve"> del precio.</w:t>
+        <w:t xml:space="preserve"> del precio, descontados los costes que la Finca se ahorra por no celebrarlo (limpieza, consumibles, personal de refuerzo y servicios extra no prestados).</w:t>
       </w:r>
     </w:p>
     <w:p>
@@ -611,7 +642,7 @@
         <w:spacing w:after="160"/>
       </w:pPr>
       <w:r>
-        <w:t>Al tratarse de un servicio de ocio que se presta en una fecha determinada, el Cliente no dispone del derecho de desistimiento previsto en el artículo 103.l del texto refundido de la Ley General para la Defensa de los Consumidores y Usuarios. Lo que sí puede hacer es cancelar con las consecuencias económicas de la cláusula séptima. El Cliente declara haber sido informado de ello antes de firmar.</w:t>
+        <w:t>Si este contrato se celebra a distancia o fuera de las instalaciones de la Finca, el Cliente no tiene derecho de desistimiento, porque es un servicio de esparcimiento con una fecha de ejecución determinada (artículo 103.l del texto refundido de la Ley General para la Defensa de los Consumidores y Usuarios). Lo que sí puede hacer es cancelar con las consecuencias económicas de la cláusula séptima. El Cliente declara haber sido informado de ello antes de firmar.</w:t>
       </w:r>
     </w:p>
     <w:p>
@@ -888,7 +919,7 @@
         <w:spacing w:after="160"/>
       </w:pPr>
       <w:r>
-        <w:t>La seguridad alimentaria, la información de alérgenos y la comida testigo de lo que se sirve son responsabilidad del Catering, que las asume ante el Cliente y los invitados. El Cliente comunicará al Catering las alergias e intolerancias de sus invitados en el recuento final. La Finca facilita la cocina o el office que el Catering utiliza, pero no elabora ni sirve alimentos.</w:t>
+        <w:t>La seguridad alimentaria, la información de alérgenos y la comida testigo de lo que se sirve corresponden al Catering, que contrata el menú directamente con el Cliente (cláusula primera). El Cliente comunicará al Catering las alergias e intolerancias de sus invitados en el recuento final. La Finca facilita la cocina o el office que el Catering utiliza, pero no elabora ni sirve alimentos.</w:t>
       </w:r>
     </w:p>
     <w:p>
@@ -1097,7 +1128,7 @@
         <w:t>5 %</w:t>
       </w:r>
       <w:r>
-        <w:t xml:space="preserve">; de 6 a 11 meses, </w:t>
+        <w:t xml:space="preserve">; de 6 meses a menos de 12, </w:t>
       </w:r>
       <w:r>
         <w:rPr>
@@ -1106,7 +1137,7 @@
         <w:t>15 %</w:t>
       </w:r>
       <w:r>
-        <w:t xml:space="preserve">; de 3 a 5 meses, </w:t>
+        <w:t xml:space="preserve">; de 3 meses a menos de 6, </w:t>
       </w:r>
       <w:r>
         <w:rPr>
@@ -1115,7 +1146,7 @@
         <w:t>35 %</w:t>
       </w:r>
       <w:r>
-        <w:t xml:space="preserve">; de 1 a 2 meses, </w:t>
+        <w:t xml:space="preserve">; de 1 mes a menos de 3, </w:t>
       </w:r>
       <w:r>
         <w:rPr>

</xml_diff>